<commit_message>
update all sorts of scripts
</commit_message>
<xml_diff>
--- a/output/tables/Marsh.tit.effect.sizes.docx
+++ b/output/tables/Marsh.tit.effect.sizes.docx
@@ -82,27 +82,27 @@
               <w:pStyle w:val="Normal"/>
             </w:pPr>
             <w:r>
-              <w:t>0.39</w:t>
-            </w:r>
-          </w:p>
-        </w:tc>
-        <w:tc>
-          <w:p>
-            <w:pPr>
-              <w:pStyle w:val="Normal"/>
-            </w:pPr>
-            <w:r>
-              <w:t>0.39</w:t>
-            </w:r>
-          </w:p>
-        </w:tc>
-        <w:tc>
-          <w:p>
-            <w:pPr>
-              <w:pStyle w:val="Normal"/>
-            </w:pPr>
-            <w:r>
-              <w:t>0.40</w:t>
+              <w:t>-0.95</w:t>
+            </w:r>
+          </w:p>
+        </w:tc>
+        <w:tc>
+          <w:p>
+            <w:pPr>
+              <w:pStyle w:val="Normal"/>
+            </w:pPr>
+            <w:r>
+              <w:t>-0.96</w:t>
+            </w:r>
+          </w:p>
+        </w:tc>
+        <w:tc>
+          <w:p>
+            <w:pPr>
+              <w:pStyle w:val="Normal"/>
+            </w:pPr>
+            <w:r>
+              <w:t>-0.93</w:t>
             </w:r>
           </w:p>
         </w:tc>
@@ -134,27 +134,27 @@
               <w:pStyle w:val="Normal"/>
             </w:pPr>
             <w:r>
-              <w:t>1.66</w:t>
-            </w:r>
-          </w:p>
-        </w:tc>
-        <w:tc>
-          <w:p>
-            <w:pPr>
-              <w:pStyle w:val="Normal"/>
-            </w:pPr>
-            <w:r>
-              <w:t>1.63</w:t>
-            </w:r>
-          </w:p>
-        </w:tc>
-        <w:tc>
-          <w:p>
-            <w:pPr>
-              <w:pStyle w:val="Normal"/>
-            </w:pPr>
-            <w:r>
-              <w:t>1.68</w:t>
+              <w:t>0.53</w:t>
+            </w:r>
+          </w:p>
+        </w:tc>
+        <w:tc>
+          <w:p>
+            <w:pPr>
+              <w:pStyle w:val="Normal"/>
+            </w:pPr>
+            <w:r>
+              <w:t>0.52</w:t>
+            </w:r>
+          </w:p>
+        </w:tc>
+        <w:tc>
+          <w:p>
+            <w:pPr>
+              <w:pStyle w:val="Normal"/>
+            </w:pPr>
+            <w:r>
+              <w:t>0.54</w:t>
             </w:r>
           </w:p>
         </w:tc>
@@ -186,27 +186,27 @@
               <w:pStyle w:val="Normal"/>
             </w:pPr>
             <w:r>
-              <w:t>1.22</w:t>
-            </w:r>
-          </w:p>
-        </w:tc>
-        <w:tc>
-          <w:p>
-            <w:pPr>
-              <w:pStyle w:val="Normal"/>
-            </w:pPr>
-            <w:r>
-              <w:t>1.20</w:t>
-            </w:r>
-          </w:p>
-        </w:tc>
-        <w:tc>
-          <w:p>
-            <w:pPr>
-              <w:pStyle w:val="Normal"/>
-            </w:pPr>
-            <w:r>
-              <w:t>1.23</w:t>
+              <w:t>0.21</w:t>
+            </w:r>
+          </w:p>
+        </w:tc>
+        <w:tc>
+          <w:p>
+            <w:pPr>
+              <w:pStyle w:val="Normal"/>
+            </w:pPr>
+            <w:r>
+              <w:t>0.20</w:t>
+            </w:r>
+          </w:p>
+        </w:tc>
+        <w:tc>
+          <w:p>
+            <w:pPr>
+              <w:pStyle w:val="Normal"/>
+            </w:pPr>
+            <w:r>
+              <w:t>0.22</w:t>
             </w:r>
           </w:p>
         </w:tc>
@@ -238,27 +238,27 @@
               <w:pStyle w:val="Normal"/>
             </w:pPr>
             <w:r>
-              <w:t>1.16</w:t>
-            </w:r>
-          </w:p>
-        </w:tc>
-        <w:tc>
-          <w:p>
-            <w:pPr>
-              <w:pStyle w:val="Normal"/>
-            </w:pPr>
-            <w:r>
-              <w:t>1.15</w:t>
-            </w:r>
-          </w:p>
-        </w:tc>
-        <w:tc>
-          <w:p>
-            <w:pPr>
-              <w:pStyle w:val="Normal"/>
-            </w:pPr>
-            <w:r>
-              <w:t>1.18</w:t>
+              <w:t>0.14</w:t>
+            </w:r>
+          </w:p>
+        </w:tc>
+        <w:tc>
+          <w:p>
+            <w:pPr>
+              <w:pStyle w:val="Normal"/>
+            </w:pPr>
+            <w:r>
+              <w:t>0.12</w:t>
+            </w:r>
+          </w:p>
+        </w:tc>
+        <w:tc>
+          <w:p>
+            <w:pPr>
+              <w:pStyle w:val="Normal"/>
+            </w:pPr>
+            <w:r>
+              <w:t>0.15</w:t>
             </w:r>
           </w:p>
         </w:tc>
@@ -290,27 +290,27 @@
               <w:pStyle w:val="Normal"/>
             </w:pPr>
             <w:r>
-              <w:t>1.20</w:t>
-            </w:r>
-          </w:p>
-        </w:tc>
-        <w:tc>
-          <w:p>
-            <w:pPr>
-              <w:pStyle w:val="Normal"/>
-            </w:pPr>
-            <w:r>
-              <w:t>1.19</w:t>
-            </w:r>
-          </w:p>
-        </w:tc>
-        <w:tc>
-          <w:p>
-            <w:pPr>
-              <w:pStyle w:val="Normal"/>
-            </w:pPr>
-            <w:r>
-              <w:t>1.21</w:t>
+              <w:t>0.19</w:t>
+            </w:r>
+          </w:p>
+        </w:tc>
+        <w:tc>
+          <w:p>
+            <w:pPr>
+              <w:pStyle w:val="Normal"/>
+            </w:pPr>
+            <w:r>
+              <w:t>0.18</w:t>
+            </w:r>
+          </w:p>
+        </w:tc>
+        <w:tc>
+          <w:p>
+            <w:pPr>
+              <w:pStyle w:val="Normal"/>
+            </w:pPr>
+            <w:r>
+              <w:t>0.20</w:t>
             </w:r>
           </w:p>
         </w:tc>
@@ -342,27 +342,27 @@
               <w:pStyle w:val="Normal"/>
             </w:pPr>
             <w:r>
-              <w:t>1.14</w:t>
-            </w:r>
-          </w:p>
-        </w:tc>
-        <w:tc>
-          <w:p>
-            <w:pPr>
-              <w:pStyle w:val="Normal"/>
-            </w:pPr>
-            <w:r>
-              <w:t>1.13</w:t>
-            </w:r>
-          </w:p>
-        </w:tc>
-        <w:tc>
-          <w:p>
-            <w:pPr>
-              <w:pStyle w:val="Normal"/>
-            </w:pPr>
-            <w:r>
-              <w:t>1.15</w:t>
+              <w:t>0.13</w:t>
+            </w:r>
+          </w:p>
+        </w:tc>
+        <w:tc>
+          <w:p>
+            <w:pPr>
+              <w:pStyle w:val="Normal"/>
+            </w:pPr>
+            <w:r>
+              <w:t>0.12</w:t>
+            </w:r>
+          </w:p>
+        </w:tc>
+        <w:tc>
+          <w:p>
+            <w:pPr>
+              <w:pStyle w:val="Normal"/>
+            </w:pPr>
+            <w:r>
+              <w:t>0.14</w:t>
             </w:r>
           </w:p>
         </w:tc>

</xml_diff>